<commit_message>
Regenerate ER diagram with colleges entity and update the report
The ER diagram now shows all eleven entities including COLLEGES and its
one-to-many relationship with STUDENTS. Report updated: table counts,
Table 4.1 and 4.2 rows for colleges, FR-23 and FR-24, the college routes,
and test cases 25 and 26.

Co-Authored-By: Claude Fable 5 <noreply@anthropic.com>
Claude-Session: https://claude.ai/code/session_013xPLnyFTSjbxMiATP4c7ND
</commit_message>
<xml_diff>
--- a/docs/Internship_Portal_Full_Report.docx
+++ b/docs/Internship_Portal_Full_Report.docx
@@ -1828,7 +1828,7 @@
         <w:jc w:val="both"/>
       </w:pPr>
       <w:r>
-        <w:t>Database design completed with ten related tables, primary and foreign keys, unique constraints, and cascade rules.</w:t>
+        <w:t>Database design completed with eleven related tables, primary and foreign keys, unique constraints, and cascade rules.</w:t>
       </w:r>
     </w:p>
     <w:p>
@@ -3956,6 +3956,78 @@
                 <w:sz w:val="22"/>
               </w:rPr>
               <w:t>The system shall expose a JSON REST API providing system statistics and the list of open internships.</w:t>
+            </w:r>
+          </w:p>
+        </w:tc>
+      </w:tr>
+      <w:tr>
+        <w:tc>
+          <w:tcPr>
+            <w:tcW w:type="dxa" w:w="4513"/>
+          </w:tcPr>
+          <w:p>
+            <w:pPr>
+              <w:spacing w:line="240" w:lineRule="auto" w:before="40" w:after="40"/>
+            </w:pPr>
+            <w:r>
+              <w:rPr>
+                <w:rFonts w:ascii="Times New Roman" w:hAnsi="Times New Roman"/>
+                <w:sz w:val="22"/>
+              </w:rPr>
+              <w:t>FR-23</w:t>
+            </w:r>
+          </w:p>
+        </w:tc>
+        <w:tc>
+          <w:tcPr>
+            <w:tcW w:type="dxa" w:w="4513"/>
+          </w:tcPr>
+          <w:p>
+            <w:pPr>
+              <w:spacing w:line="240" w:lineRule="auto" w:before="40" w:after="40"/>
+            </w:pPr>
+            <w:r>
+              <w:rPr>
+                <w:rFonts w:ascii="Times New Roman" w:hAnsi="Times New Roman"/>
+                <w:sz w:val="22"/>
+              </w:rPr>
+              <w:t>A student shall select their college during registration, and the administrator shall be able to add and remove colleges without affecting existing student accounts.</w:t>
+            </w:r>
+          </w:p>
+        </w:tc>
+      </w:tr>
+      <w:tr>
+        <w:tc>
+          <w:tcPr>
+            <w:tcW w:type="dxa" w:w="4513"/>
+          </w:tcPr>
+          <w:p>
+            <w:pPr>
+              <w:spacing w:line="240" w:lineRule="auto" w:before="40" w:after="40"/>
+            </w:pPr>
+            <w:r>
+              <w:rPr>
+                <w:rFonts w:ascii="Times New Roman" w:hAnsi="Times New Roman"/>
+                <w:sz w:val="22"/>
+              </w:rPr>
+              <w:t>FR-24</w:t>
+            </w:r>
+          </w:p>
+        </w:tc>
+        <w:tc>
+          <w:tcPr>
+            <w:tcW w:type="dxa" w:w="4513"/>
+          </w:tcPr>
+          <w:p>
+            <w:pPr>
+              <w:spacing w:line="240" w:lineRule="auto" w:before="40" w:after="40"/>
+            </w:pPr>
+            <w:r>
+              <w:rPr>
+                <w:rFonts w:ascii="Times New Roman" w:hAnsi="Times New Roman"/>
+                <w:sz w:val="22"/>
+              </w:rPr>
+              <w:t>The public landing page shall list the companies working with the portal and the participating colleges.</w:t>
             </w:r>
           </w:p>
         </w:tc>
@@ -7108,7 +7180,7 @@
         <w:jc w:val="both"/>
       </w:pPr>
       <w:r>
-        <w:t>Data layer: the MySQL database internship_db with ten related tables created by database.sql, protected by primary keys, foreign keys, unique constraints, and cascade rules.</w:t>
+        <w:t>Data layer: the MySQL database internship_db with eleven related tables created by database.sql, protected by primary keys, foreign keys, unique constraints, and cascade rules.</w:t>
       </w:r>
     </w:p>
     <w:p>
@@ -7161,11 +7233,6 @@
       <w:pPr>
         <w:jc w:val="center"/>
       </w:pPr>
-      <w:r>
-        <w:rPr>
-          <w:b/>
-        </w:rPr>
-      </w:r>
       <w:r>
         <w:drawing>
           <wp:inline xmlns:a="http://schemas.openxmlformats.org/drawingml/2006/main" xmlns:pic="http://schemas.openxmlformats.org/drawingml/2006/picture">
@@ -7182,7 +7249,7 @@
                     <pic:cNvPicPr/>
                   </pic:nvPicPr>
                   <pic:blipFill>
-                    <a:blip r:embed="rId33"/>
+                    <a:blip r:embed="rId34"/>
                     <a:stretch>
                       <a:fillRect/>
                     </a:stretch>
@@ -7228,7 +7295,7 @@
         <w:rPr>
           <w:b w:val="0"/>
         </w:rPr>
-        <w:t>The database internship_db contains the following ten tables.</w:t>
+        <w:t>The database internship_db contains the following eleven tables.</w:t>
       </w:r>
     </w:p>
     <w:p>
@@ -7871,6 +7938,59 @@
           </w:p>
         </w:tc>
       </w:tr>
+      <w:tr>
+        <w:tc>
+          <w:tcPr>
+            <w:tcW w:type="dxa" w:w="3009"/>
+          </w:tcPr>
+          <w:p>
+            <w:pPr>
+              <w:spacing w:line="240" w:lineRule="auto" w:before="40" w:after="40"/>
+            </w:pPr>
+            <w:r>
+              <w:rPr>
+                <w:rFonts w:ascii="Times New Roman" w:hAnsi="Times New Roman"/>
+                <w:sz w:val="22"/>
+              </w:rPr>
+              <w:t>colleges</w:t>
+            </w:r>
+          </w:p>
+        </w:tc>
+        <w:tc>
+          <w:tcPr>
+            <w:tcW w:type="dxa" w:w="3009"/>
+          </w:tcPr>
+          <w:p>
+            <w:pPr>
+              <w:spacing w:line="240" w:lineRule="auto" w:before="40" w:after="40"/>
+            </w:pPr>
+            <w:r>
+              <w:rPr>
+                <w:rFonts w:ascii="Times New Roman" w:hAnsi="Times New Roman"/>
+                <w:sz w:val="22"/>
+              </w:rPr>
+              <w:t>Institutions taking part in the internship programme</w:t>
+            </w:r>
+          </w:p>
+        </w:tc>
+        <w:tc>
+          <w:tcPr>
+            <w:tcW w:type="dxa" w:w="3009"/>
+          </w:tcPr>
+          <w:p>
+            <w:pPr>
+              <w:spacing w:line="240" w:lineRule="auto" w:before="40" w:after="40"/>
+            </w:pPr>
+            <w:r>
+              <w:rPr>
+                <w:rFonts w:ascii="Times New Roman" w:hAnsi="Times New Roman"/>
+                <w:sz w:val="22"/>
+              </w:rPr>
+              <w:t>id (PK), name (unique), affiliation, address, created_at</w:t>
+            </w:r>
+          </w:p>
+        </w:tc>
+      </w:tr>
     </w:tbl>
     <w:p>
       <w:pPr>
@@ -8516,6 +8636,59 @@
                 <w:sz w:val="22"/>
               </w:rPr>
               <w:t>audit_logs.user_id with ON DELETE SET NULL</w:t>
+            </w:r>
+          </w:p>
+        </w:tc>
+      </w:tr>
+      <w:tr>
+        <w:tc>
+          <w:tcPr>
+            <w:tcW w:type="dxa" w:w="3009"/>
+          </w:tcPr>
+          <w:p>
+            <w:pPr>
+              <w:spacing w:line="240" w:lineRule="auto" w:before="40" w:after="40"/>
+            </w:pPr>
+            <w:r>
+              <w:rPr>
+                <w:rFonts w:ascii="Times New Roman" w:hAnsi="Times New Roman"/>
+                <w:sz w:val="22"/>
+              </w:rPr>
+              <w:t>colleges to students</w:t>
+            </w:r>
+          </w:p>
+        </w:tc>
+        <w:tc>
+          <w:tcPr>
+            <w:tcW w:type="dxa" w:w="3009"/>
+          </w:tcPr>
+          <w:p>
+            <w:pPr>
+              <w:spacing w:line="240" w:lineRule="auto" w:before="40" w:after="40"/>
+            </w:pPr>
+            <w:r>
+              <w:rPr>
+                <w:rFonts w:ascii="Times New Roman" w:hAnsi="Times New Roman"/>
+                <w:sz w:val="22"/>
+              </w:rPr>
+              <w:t>one-to-many</w:t>
+            </w:r>
+          </w:p>
+        </w:tc>
+        <w:tc>
+          <w:tcPr>
+            <w:tcW w:type="dxa" w:w="3009"/>
+          </w:tcPr>
+          <w:p>
+            <w:pPr>
+              <w:spacing w:line="240" w:lineRule="auto" w:before="40" w:after="40"/>
+            </w:pPr>
+            <w:r>
+              <w:rPr>
+                <w:rFonts w:ascii="Times New Roman" w:hAnsi="Times New Roman"/>
+                <w:sz w:val="22"/>
+              </w:rPr>
+              <w:t>students.college_id with ON DELETE SET NULL</w:t>
             </w:r>
           </w:p>
         </w:tc>
@@ -8777,7 +8950,7 @@
         <w:rPr>
           <w:b w:val="0"/>
         </w:rPr>
-        <w:t>This chapter presented the design of the system: a three-tier client-server architecture with a thin browser client, a Flask application layer organized as a routing table over role-specific modules, and a MySQL data layer of ten normalized tables mirrored one-to-one by SQLAlchemy model classes. The interface design assigns each role a focused set of pages sharing one base layout. Together, these decisions establish a foundation on which the implementation in Chapter 5 follows directly.</w:t>
+        <w:t>This chapter presented the design of the system: a three-tier client-server architecture with a thin browser client, a Flask application layer organized as a routing table over role-specific modules, and a MySQL data layer of eleven normalized tables mirrored one-to-one by SQLAlchemy model classes. The interface design assigns each role a focused set of pages sharing one base layout. Together, these decisions establish a foundation on which the implementation in Chapter 5 follows directly.</w:t>
       </w:r>
     </w:p>
     <w:p>
@@ -10581,6 +10754,146 @@
           </w:p>
         </w:tc>
       </w:tr>
+      <w:tr>
+        <w:tc>
+          <w:tcPr>
+            <w:tcW w:type="dxa" w:w="2256"/>
+          </w:tcPr>
+          <w:p>
+            <w:pPr>
+              <w:spacing w:line="240" w:lineRule="auto" w:before="40" w:after="40"/>
+            </w:pPr>
+            <w:r>
+              <w:rPr>
+                <w:rFonts w:ascii="Times New Roman" w:hAnsi="Times New Roman"/>
+                <w:sz w:val="22"/>
+              </w:rPr>
+              <w:t>/colleges</w:t>
+            </w:r>
+          </w:p>
+        </w:tc>
+        <w:tc>
+          <w:tcPr>
+            <w:tcW w:type="dxa" w:w="2256"/>
+          </w:tcPr>
+          <w:p>
+            <w:pPr>
+              <w:spacing w:line="240" w:lineRule="auto" w:before="40" w:after="40"/>
+            </w:pPr>
+            <w:r>
+              <w:rPr>
+                <w:rFonts w:ascii="Times New Roman" w:hAnsi="Times New Roman"/>
+                <w:sz w:val="22"/>
+              </w:rPr>
+              <w:t>GET, POST</w:t>
+            </w:r>
+          </w:p>
+        </w:tc>
+        <w:tc>
+          <w:tcPr>
+            <w:tcW w:type="dxa" w:w="2256"/>
+          </w:tcPr>
+          <w:p>
+            <w:pPr>
+              <w:spacing w:line="240" w:lineRule="auto" w:before="40" w:after="40"/>
+            </w:pPr>
+            <w:r>
+              <w:rPr>
+                <w:rFonts w:ascii="Times New Roman" w:hAnsi="Times New Roman"/>
+                <w:sz w:val="22"/>
+              </w:rPr>
+              <w:t>colleges (admin.py)</w:t>
+            </w:r>
+          </w:p>
+        </w:tc>
+        <w:tc>
+          <w:tcPr>
+            <w:tcW w:type="dxa" w:w="2256"/>
+          </w:tcPr>
+          <w:p>
+            <w:pPr>
+              <w:spacing w:line="240" w:lineRule="auto" w:before="40" w:after="40"/>
+            </w:pPr>
+            <w:r>
+              <w:rPr>
+                <w:rFonts w:ascii="Times New Roman" w:hAnsi="Times New Roman"/>
+                <w:sz w:val="22"/>
+              </w:rPr>
+              <w:t>List and add colleges</w:t>
+            </w:r>
+          </w:p>
+        </w:tc>
+      </w:tr>
+      <w:tr>
+        <w:tc>
+          <w:tcPr>
+            <w:tcW w:type="dxa" w:w="2256"/>
+          </w:tcPr>
+          <w:p>
+            <w:pPr>
+              <w:spacing w:line="240" w:lineRule="auto" w:before="40" w:after="40"/>
+            </w:pPr>
+            <w:r>
+              <w:rPr>
+                <w:rFonts w:ascii="Times New Roman" w:hAnsi="Times New Roman"/>
+                <w:sz w:val="22"/>
+              </w:rPr>
+              <w:t>/colleges/delete/&lt;id&gt;</w:t>
+            </w:r>
+          </w:p>
+        </w:tc>
+        <w:tc>
+          <w:tcPr>
+            <w:tcW w:type="dxa" w:w="2256"/>
+          </w:tcPr>
+          <w:p>
+            <w:pPr>
+              <w:spacing w:line="240" w:lineRule="auto" w:before="40" w:after="40"/>
+            </w:pPr>
+            <w:r>
+              <w:rPr>
+                <w:rFonts w:ascii="Times New Roman" w:hAnsi="Times New Roman"/>
+                <w:sz w:val="22"/>
+              </w:rPr>
+              <w:t>POST</w:t>
+            </w:r>
+          </w:p>
+        </w:tc>
+        <w:tc>
+          <w:tcPr>
+            <w:tcW w:type="dxa" w:w="2256"/>
+          </w:tcPr>
+          <w:p>
+            <w:pPr>
+              <w:spacing w:line="240" w:lineRule="auto" w:before="40" w:after="40"/>
+            </w:pPr>
+            <w:r>
+              <w:rPr>
+                <w:rFonts w:ascii="Times New Roman" w:hAnsi="Times New Roman"/>
+                <w:sz w:val="22"/>
+              </w:rPr>
+              <w:t>delete_college (admin.py)</w:t>
+            </w:r>
+          </w:p>
+        </w:tc>
+        <w:tc>
+          <w:tcPr>
+            <w:tcW w:type="dxa" w:w="2256"/>
+          </w:tcPr>
+          <w:p>
+            <w:pPr>
+              <w:spacing w:line="240" w:lineRule="auto" w:before="40" w:after="40"/>
+            </w:pPr>
+            <w:r>
+              <w:rPr>
+                <w:rFonts w:ascii="Times New Roman" w:hAnsi="Times New Roman"/>
+                <w:sz w:val="22"/>
+              </w:rPr>
+              <w:t>Remove a college</w:t>
+            </w:r>
+          </w:p>
+        </w:tc>
+      </w:tr>
     </w:tbl>
     <w:p>
       <w:pPr>
@@ -13192,6 +13505,180 @@
           </w:p>
         </w:tc>
       </w:tr>
+      <w:tr>
+        <w:tc>
+          <w:tcPr>
+            <w:tcW w:type="dxa" w:w="1805"/>
+          </w:tcPr>
+          <w:p>
+            <w:pPr>
+              <w:spacing w:line="240" w:lineRule="auto" w:before="40" w:after="40"/>
+            </w:pPr>
+            <w:r>
+              <w:rPr>
+                <w:rFonts w:ascii="Times New Roman" w:hAnsi="Times New Roman"/>
+                <w:sz w:val="22"/>
+              </w:rPr>
+              <w:t>25</w:t>
+            </w:r>
+          </w:p>
+        </w:tc>
+        <w:tc>
+          <w:tcPr>
+            <w:tcW w:type="dxa" w:w="1805"/>
+          </w:tcPr>
+          <w:p>
+            <w:pPr>
+              <w:spacing w:line="240" w:lineRule="auto" w:before="40" w:after="40"/>
+            </w:pPr>
+            <w:r>
+              <w:rPr>
+                <w:rFonts w:ascii="Times New Roman" w:hAnsi="Times New Roman"/>
+                <w:sz w:val="22"/>
+              </w:rPr>
+              <w:t>Student linked to a college</w:t>
+            </w:r>
+          </w:p>
+        </w:tc>
+        <w:tc>
+          <w:tcPr>
+            <w:tcW w:type="dxa" w:w="1805"/>
+          </w:tcPr>
+          <w:p>
+            <w:pPr>
+              <w:spacing w:line="240" w:lineRule="auto" w:before="40" w:after="40"/>
+            </w:pPr>
+            <w:r>
+              <w:rPr>
+                <w:rFonts w:ascii="Times New Roman" w:hAnsi="Times New Roman"/>
+                <w:sz w:val="22"/>
+              </w:rPr>
+              <w:t>Register choosing a college</w:t>
+            </w:r>
+          </w:p>
+        </w:tc>
+        <w:tc>
+          <w:tcPr>
+            <w:tcW w:type="dxa" w:w="1805"/>
+          </w:tcPr>
+          <w:p>
+            <w:pPr>
+              <w:spacing w:line="240" w:lineRule="auto" w:before="40" w:after="40"/>
+            </w:pPr>
+            <w:r>
+              <w:rPr>
+                <w:rFonts w:ascii="Times New Roman" w:hAnsi="Times New Roman"/>
+                <w:sz w:val="22"/>
+              </w:rPr>
+              <w:t>The college is stored and shown on the landing page</w:t>
+            </w:r>
+          </w:p>
+        </w:tc>
+        <w:tc>
+          <w:tcPr>
+            <w:tcW w:type="dxa" w:w="1805"/>
+          </w:tcPr>
+          <w:p>
+            <w:pPr>
+              <w:spacing w:line="240" w:lineRule="auto" w:before="40" w:after="40"/>
+            </w:pPr>
+            <w:r>
+              <w:rPr>
+                <w:rFonts w:ascii="Times New Roman" w:hAnsi="Times New Roman"/>
+                <w:sz w:val="22"/>
+              </w:rPr>
+              <w:t>Pass</w:t>
+            </w:r>
+          </w:p>
+        </w:tc>
+      </w:tr>
+      <w:tr>
+        <w:tc>
+          <w:tcPr>
+            <w:tcW w:type="dxa" w:w="1805"/>
+          </w:tcPr>
+          <w:p>
+            <w:pPr>
+              <w:spacing w:line="240" w:lineRule="auto" w:before="40" w:after="40"/>
+            </w:pPr>
+            <w:r>
+              <w:rPr>
+                <w:rFonts w:ascii="Times New Roman" w:hAnsi="Times New Roman"/>
+                <w:sz w:val="22"/>
+              </w:rPr>
+              <w:t>26</w:t>
+            </w:r>
+          </w:p>
+        </w:tc>
+        <w:tc>
+          <w:tcPr>
+            <w:tcW w:type="dxa" w:w="1805"/>
+          </w:tcPr>
+          <w:p>
+            <w:pPr>
+              <w:spacing w:line="240" w:lineRule="auto" w:before="40" w:after="40"/>
+            </w:pPr>
+            <w:r>
+              <w:rPr>
+                <w:rFonts w:ascii="Times New Roman" w:hAnsi="Times New Roman"/>
+                <w:sz w:val="22"/>
+              </w:rPr>
+              <w:t>College management</w:t>
+            </w:r>
+          </w:p>
+        </w:tc>
+        <w:tc>
+          <w:tcPr>
+            <w:tcW w:type="dxa" w:w="1805"/>
+          </w:tcPr>
+          <w:p>
+            <w:pPr>
+              <w:spacing w:line="240" w:lineRule="auto" w:before="40" w:after="40"/>
+            </w:pPr>
+            <w:r>
+              <w:rPr>
+                <w:rFonts w:ascii="Times New Roman" w:hAnsi="Times New Roman"/>
+                <w:sz w:val="22"/>
+              </w:rPr>
+              <w:t>Admin adds, duplicates and removes a college</w:t>
+            </w:r>
+          </w:p>
+        </w:tc>
+        <w:tc>
+          <w:tcPr>
+            <w:tcW w:type="dxa" w:w="1805"/>
+          </w:tcPr>
+          <w:p>
+            <w:pPr>
+              <w:spacing w:line="240" w:lineRule="auto" w:before="40" w:after="40"/>
+            </w:pPr>
+            <w:r>
+              <w:rPr>
+                <w:rFonts w:ascii="Times New Roman" w:hAnsi="Times New Roman"/>
+                <w:sz w:val="22"/>
+              </w:rPr>
+              <w:t>Duplicate is refused; removal keeps the student accounts</w:t>
+            </w:r>
+          </w:p>
+        </w:tc>
+        <w:tc>
+          <w:tcPr>
+            <w:tcW w:type="dxa" w:w="1805"/>
+          </w:tcPr>
+          <w:p>
+            <w:pPr>
+              <w:spacing w:line="240" w:lineRule="auto" w:before="40" w:after="40"/>
+            </w:pPr>
+            <w:r>
+              <w:rPr>
+                <w:rFonts w:ascii="Times New Roman" w:hAnsi="Times New Roman"/>
+                <w:sz w:val="22"/>
+              </w:rPr>
+              <w:t>Pass</w:t>
+            </w:r>
+          </w:p>
+        </w:tc>
+      </w:tr>
     </w:tbl>
     <w:p>
       <w:pPr>
@@ -13219,7 +13706,7 @@
         <w:rPr>
           <w:b w:val="0"/>
         </w:rPr>
-        <w:t>All twenty-four test cases of Table 5.2 pass. This section summarizes the observed results of each functional area.</w:t>
+        <w:t>All twenty-six test cases of Table 5.2 pass. This section summarizes the observed results of each functional area.</w:t>
       </w:r>
     </w:p>
     <w:p>
@@ -13569,7 +14056,7 @@
         <w:rPr>
           <w:b w:val="0"/>
         </w:rPr>
-        <w:t>The Internship Portal Management System was proposed to address the limitations of the traditional, manual internship process. The project has been completed and achieved all of its objectives: a fully working web application with complete database connectivity and all four CRUD operations implemented through the SQLAlchemy ORM, where each of the ten tables is a Python model class. The complete internship workflow, from a company posting an opening to a supervisor marking a student’s weekly log, works end to end with role-based access control and hashed passwords, and all twenty-four documented test cases pass. Beyond the core workflow, the delivered system also provides analytics dashboards, in-application notifications, an audit trail, searchable and paginated administrative tables with CSV export, and a JSON REST API.</w:t>
+        <w:t>The Internship Portal Management System was proposed to address the limitations of the traditional, manual internship process. The project has been completed and achieved all of its objectives: a fully working web application with complete database connectivity and all four CRUD operations implemented through the SQLAlchemy ORM, where each of the eleven tables is a Python model class. The complete internship workflow, from a company posting an opening to a supervisor marking a student’s weekly log, works end to end with role-based access control and hashed passwords, and all twenty-six documented test cases pass. Beyond the core workflow, the delivered system also provides analytics dashboards, in-application notifications, an audit trail, searchable and paginated administrative tables with CSV export, and a JSON REST API.</w:t>
       </w:r>
     </w:p>
     <w:p>

</xml_diff>

<commit_message>
Add CSRF protection with Flask-WTF
CSRFProtect is enabled application wide and all fifteen POST forms now carry
a server generated token, so a request forged by another site is rejected
with HTTP 400. The read-only JSON endpoints are exempt. The secret key now
reads from the SECRET_KEY environment variable when one is set.

Adds test case 27 (four tests): a POST without a token is refused and nobody
is logged in, every form contains a token, a request carrying the token still
works, and the JSON API is unaffected. Report, README and viva sheet updated.

Co-Authored-By: Claude Fable 5 <noreply@anthropic.com>
Claude-Session: https://claude.ai/code/session_013xPLnyFTSjbxMiATP4c7ND
</commit_message>
<xml_diff>
--- a/docs/Internship_Portal_Full_Report.docx
+++ b/docs/Internship_Portal_Full_Report.docx
@@ -4627,6 +4627,59 @@
                 <w:sz w:val="22"/>
               </w:rPr>
               <w:t>Important actions shall be recorded with the acting user and timestamp so that system activity can be reviewed afterwards.</w:t>
+            </w:r>
+          </w:p>
+        </w:tc>
+      </w:tr>
+      <w:tr>
+        <w:tc>
+          <w:tcPr>
+            <w:tcW w:type="dxa" w:w="3009"/>
+          </w:tcPr>
+          <w:p>
+            <w:pPr>
+              <w:spacing w:line="240" w:lineRule="auto" w:before="40" w:after="40"/>
+            </w:pPr>
+            <w:r>
+              <w:rPr>
+                <w:rFonts w:ascii="Times New Roman" w:hAnsi="Times New Roman"/>
+                <w:sz w:val="22"/>
+              </w:rPr>
+              <w:t>NFR-10</w:t>
+            </w:r>
+          </w:p>
+        </w:tc>
+        <w:tc>
+          <w:tcPr>
+            <w:tcW w:type="dxa" w:w="3009"/>
+          </w:tcPr>
+          <w:p>
+            <w:pPr>
+              <w:spacing w:line="240" w:lineRule="auto" w:before="40" w:after="40"/>
+            </w:pPr>
+            <w:r>
+              <w:rPr>
+                <w:rFonts w:ascii="Times New Roman" w:hAnsi="Times New Roman"/>
+                <w:sz w:val="22"/>
+              </w:rPr>
+              <w:t>Security</w:t>
+            </w:r>
+          </w:p>
+        </w:tc>
+        <w:tc>
+          <w:tcPr>
+            <w:tcW w:type="dxa" w:w="3009"/>
+          </w:tcPr>
+          <w:p>
+            <w:pPr>
+              <w:spacing w:line="240" w:lineRule="auto" w:before="40" w:after="40"/>
+            </w:pPr>
+            <w:r>
+              <w:rPr>
+                <w:rFonts w:ascii="Times New Roman" w:hAnsi="Times New Roman"/>
+                <w:sz w:val="22"/>
+              </w:rPr>
+              <w:t>Every form shall carry a CSRF token generated by the server, and a request arriving without a valid token shall be rejected.</w:t>
             </w:r>
           </w:p>
         </w:tc>
@@ -6761,6 +6814,42 @@
           </w:p>
         </w:tc>
       </w:tr>
+      <w:tr>
+        <w:tc>
+          <w:tcPr>
+            <w:tcW w:type="dxa" w:w="4513"/>
+          </w:tcPr>
+          <w:p>
+            <w:pPr>
+              <w:spacing w:line="240" w:lineRule="auto" w:before="40" w:after="40"/>
+            </w:pPr>
+            <w:r>
+              <w:rPr>
+                <w:rFonts w:ascii="Times New Roman" w:hAnsi="Times New Roman"/>
+                <w:sz w:val="22"/>
+              </w:rPr>
+              <w:t>Flask-WTF</w:t>
+            </w:r>
+          </w:p>
+        </w:tc>
+        <w:tc>
+          <w:tcPr>
+            <w:tcW w:type="dxa" w:w="4513"/>
+          </w:tcPr>
+          <w:p>
+            <w:pPr>
+              <w:spacing w:line="240" w:lineRule="auto" w:before="40" w:after="40"/>
+            </w:pPr>
+            <w:r>
+              <w:rPr>
+                <w:rFonts w:ascii="Times New Roman" w:hAnsi="Times New Roman"/>
+                <w:sz w:val="22"/>
+              </w:rPr>
+              <w:t>CSRF protection for all forms</w:t>
+            </w:r>
+          </w:p>
+        </w:tc>
+      </w:tr>
     </w:tbl>
     <w:p>
       <w:pPr>
@@ -9019,7 +9108,7 @@
         <w:jc w:val="both"/>
       </w:pPr>
       <w:r>
-        <w:t>SQLAlchemy (through the Flask-SQLAlchemy extension) maps every table to a Python model class and generates all SQL with bound parameters.</w:t>
+        <w:t>SQLAlchemy (through the Flask-SQLAlchemy extension) maps every table to a Python model class and generates all SQL with bound parameters. Flask-WTF provides CSRF protection: the server places a token in every form and rejects any POST that arrives without it.</w:t>
       </w:r>
     </w:p>
     <w:p>
@@ -13679,6 +13768,93 @@
           </w:p>
         </w:tc>
       </w:tr>
+      <w:tr>
+        <w:tc>
+          <w:tcPr>
+            <w:tcW w:type="dxa" w:w="1805"/>
+          </w:tcPr>
+          <w:p>
+            <w:pPr>
+              <w:spacing w:line="240" w:lineRule="auto" w:before="40" w:after="40"/>
+            </w:pPr>
+            <w:r>
+              <w:rPr>
+                <w:rFonts w:ascii="Times New Roman" w:hAnsi="Times New Roman"/>
+                <w:sz w:val="22"/>
+              </w:rPr>
+              <w:t>27</w:t>
+            </w:r>
+          </w:p>
+        </w:tc>
+        <w:tc>
+          <w:tcPr>
+            <w:tcW w:type="dxa" w:w="1805"/>
+          </w:tcPr>
+          <w:p>
+            <w:pPr>
+              <w:spacing w:line="240" w:lineRule="auto" w:before="40" w:after="40"/>
+            </w:pPr>
+            <w:r>
+              <w:rPr>
+                <w:rFonts w:ascii="Times New Roman" w:hAnsi="Times New Roman"/>
+                <w:sz w:val="22"/>
+              </w:rPr>
+              <w:t>CSRF protection</w:t>
+            </w:r>
+          </w:p>
+        </w:tc>
+        <w:tc>
+          <w:tcPr>
+            <w:tcW w:type="dxa" w:w="1805"/>
+          </w:tcPr>
+          <w:p>
+            <w:pPr>
+              <w:spacing w:line="240" w:lineRule="auto" w:before="40" w:after="40"/>
+            </w:pPr>
+            <w:r>
+              <w:rPr>
+                <w:rFonts w:ascii="Times New Roman" w:hAnsi="Times New Roman"/>
+                <w:sz w:val="22"/>
+              </w:rPr>
+              <w:t>Submit a POST without a token, then with one</w:t>
+            </w:r>
+          </w:p>
+        </w:tc>
+        <w:tc>
+          <w:tcPr>
+            <w:tcW w:type="dxa" w:w="1805"/>
+          </w:tcPr>
+          <w:p>
+            <w:pPr>
+              <w:spacing w:line="240" w:lineRule="auto" w:before="40" w:after="40"/>
+            </w:pPr>
+            <w:r>
+              <w:rPr>
+                <w:rFonts w:ascii="Times New Roman" w:hAnsi="Times New Roman"/>
+                <w:sz w:val="22"/>
+              </w:rPr>
+              <w:t>Request without a token is rejected with HTTP 400; the normal browser request succeeds</w:t>
+            </w:r>
+          </w:p>
+        </w:tc>
+        <w:tc>
+          <w:tcPr>
+            <w:tcW w:type="dxa" w:w="1805"/>
+          </w:tcPr>
+          <w:p>
+            <w:pPr>
+              <w:spacing w:line="240" w:lineRule="auto" w:before="40" w:after="40"/>
+            </w:pPr>
+            <w:r>
+              <w:rPr>
+                <w:rFonts w:ascii="Times New Roman" w:hAnsi="Times New Roman"/>
+                <w:sz w:val="22"/>
+              </w:rPr>
+              <w:t>Pass</w:t>
+            </w:r>
+          </w:p>
+        </w:tc>
+      </w:tr>
     </w:tbl>
     <w:p>
       <w:pPr>
@@ -13706,7 +13882,7 @@
         <w:rPr>
           <w:b w:val="0"/>
         </w:rPr>
-        <w:t>All twenty-six test cases of Table 5.2 pass. This section summarizes the observed results of each functional area.</w:t>
+        <w:t>All twenty-seven test cases of Table 5.2 pass. This section summarizes the observed results of each functional area.</w:t>
       </w:r>
     </w:p>
     <w:p>
@@ -13795,7 +13971,7 @@
     </w:p>
     <w:p>
       <w:r>
-        <w:t>The notification chain was verified end to end: applying to an internship raises an unread notification for the company, a selection or rejection notifies the student, a submitted weekly log notifies the supervisors of that company, and saved feedback notifies the student. The unread counter in the navigation bar updates accordingly and clears when the notification page is opened. The audit log was confirmed to contain entries for logins, failed logins, registrations, internship postings, application decisions, log submissions, feedback, and deletions, each with the acting user and a timestamp.</w:t>
+        <w:t>The notification chain was verified end to end: applying to an internship raises an unread notification for the company, a selection or rejection notifies the student, a submitted weekly log notifies the supervisors of that company, and saved feedback notifies the student. The unread counter in the navigation bar updates accordingly and clears when the notification page is opened. The audit log was confirmed to contain entries for logins, failed logins, registrations, internship postings, application decisions, log submissions, feedback, and deletions, each with the acting user and a timestamp. Cross site request forgery protection was verified by submitting a POST request without a token, which the system rejected with HTTP 400, while the same request made through the browser, which carries the token, succeeded normally.</w:t>
       </w:r>
     </w:p>
     <w:p>
@@ -14056,7 +14232,7 @@
         <w:rPr>
           <w:b w:val="0"/>
         </w:rPr>
-        <w:t>The Internship Portal Management System was proposed to address the limitations of the traditional, manual internship process. The project has been completed and achieved all of its objectives: a fully working web application with complete database connectivity and all four CRUD operations implemented through the SQLAlchemy ORM, where each of the eleven tables is a Python model class. The complete internship workflow, from a company posting an opening to a supervisor marking a student’s weekly log, works end to end with role-based access control and hashed passwords, and all twenty-six documented test cases pass. Beyond the core workflow, the delivered system also provides analytics dashboards, in-application notifications, an audit trail, searchable and paginated administrative tables with CSV export, and a JSON REST API.</w:t>
+        <w:t>The Internship Portal Management System was proposed to address the limitations of the traditional, manual internship process. The project has been completed and achieved all of its objectives: a fully working web application with complete database connectivity and all four CRUD operations implemented through the SQLAlchemy ORM, where each of the eleven tables is a Python model class. The complete internship workflow, from a company posting an opening to a supervisor marking a student’s weekly log, works end to end with role-based access control and hashed passwords, and all twenty-seven documented test cases pass. Beyond the core workflow, the delivered system also provides analytics dashboards, in-application notifications, an audit trail, searchable and paginated administrative tables with CSV export, and a JSON REST API.</w:t>
       </w:r>
     </w:p>
     <w:p>

</xml_diff>